<commit_message>
Revision sheet: add official Refinitiv QRC quote confirming 100-document briefcase limit
Co-authored-by: arena-agent <297053741+arena-agent@users.noreply.github.com>
</commit_message>
<xml_diff>
--- a/lseg-certification/REVISION-Certification-LSEG-Workspace.docx
+++ b/lseg-certification/REVISION-Certification-LSEG-Workspace.docx
@@ -1528,7 +1528,7 @@
           <w:b w:val="0"/>
           <w:color w:val="464646"/>
         </w:rPr>
-        <w:t xml:space="preserve"> (pas 25, pas 50, pas 200).</w:t>
+        <w:t xml:space="preserve"> (pas 25, pas 50, pas 200) — confirmé mot pour mot par la QRC officielle Refinitiv : « Up to 100 documents can be added to your briefcase ».</w:t>
       </w:r>
     </w:p>
     <w:p>
@@ -5272,16 +5272,7 @@
           <w:b w:val="0"/>
           <w:color w:val="464646"/>
         </w:rPr>
-        <w:t>. [M2]</w:t>
-      </w:r>
-    </w:p>
-    <w:p>
-      <w:r>
-        <w:rPr>
-          <w:color w:val="966400"/>
-          <w:sz w:val="17"/>
-        </w:rPr>
-        <w:t>⚠ Réponse à haute probabilité (pool candidats) : croise-la avec la fiche si le libellé diffère le jour J.</w:t>
+        <w:t xml:space="preserve"> — confirmé par la QRC officielle Refinitiv (« Up to 100 documents can be added to your briefcase »). [M2]</w:t>
       </w:r>
     </w:p>
     <w:p>

</xml_diff>